<commit_message>
Part 1 and Part 2 have been produced and published!
</commit_message>
<xml_diff>
--- a/KU-AccountCreation-Script.docx
+++ b/KU-AccountCreation-Script.docx
@@ -108,7 +108,29 @@
           <w:sz w:val="28"/>
           <w:szCs w:val="28"/>
         </w:rPr>
-        <w:t xml:space="preserve">In this video, I will let you know how you can create your Kaseya University account. </w:t>
+        <w:t xml:space="preserve">In this video, I will let you know how you can create your </w:t>
+      </w:r>
+      <w:proofErr w:type="spellStart"/>
+      <w:r>
+        <w:rPr>
+          <w:rFonts w:cs="Arial"/>
+          <w:bCs/>
+          <w:color w:val="222222"/>
+          <w:sz w:val="28"/>
+          <w:szCs w:val="28"/>
+        </w:rPr>
+        <w:t>Kaseya</w:t>
+      </w:r>
+      <w:proofErr w:type="spellEnd"/>
+      <w:r>
+        <w:rPr>
+          <w:rFonts w:cs="Arial"/>
+          <w:bCs/>
+          <w:color w:val="222222"/>
+          <w:sz w:val="28"/>
+          <w:szCs w:val="28"/>
+        </w:rPr>
+        <w:t xml:space="preserve"> University account. </w:t>
       </w:r>
     </w:p>
     <w:p>
@@ -299,7 +321,17 @@
           <w:sz w:val="28"/>
           <w:szCs w:val="28"/>
         </w:rPr>
-        <w:t xml:space="preserve"> mistake</w:t>
+        <w:t xml:space="preserve"> </w:t>
+      </w:r>
+      <w:proofErr w:type="gramStart"/>
+      <w:r>
+        <w:rPr>
+          <w:rFonts w:cs="Arial"/>
+          <w:color w:val="222222"/>
+          <w:sz w:val="28"/>
+          <w:szCs w:val="28"/>
+        </w:rPr>
+        <w:t>mistake</w:t>
       </w:r>
       <w:r>
         <w:rPr>
@@ -310,6 +342,7 @@
         </w:rPr>
         <w:t>s</w:t>
       </w:r>
+      <w:proofErr w:type="gramEnd"/>
       <w:r>
         <w:rPr>
           <w:rFonts w:cs="Arial"/>
@@ -338,7 +371,27 @@
           <w:sz w:val="28"/>
           <w:szCs w:val="28"/>
         </w:rPr>
-        <w:t>As an example, I am going to register as John Doe, whose FIU username is jdoe0001. Therefore, the Kaseya University login must be fiu2-jdoe0001.</w:t>
+        <w:t xml:space="preserve">As an example, I am going to register as John Doe, whose FIU username is jdoe0001. Therefore, the </w:t>
+      </w:r>
+      <w:proofErr w:type="spellStart"/>
+      <w:r>
+        <w:rPr>
+          <w:rFonts w:cs="Arial"/>
+          <w:color w:val="222222"/>
+          <w:sz w:val="28"/>
+          <w:szCs w:val="28"/>
+        </w:rPr>
+        <w:t>Kaseya</w:t>
+      </w:r>
+      <w:proofErr w:type="spellEnd"/>
+      <w:r>
+        <w:rPr>
+          <w:rFonts w:cs="Arial"/>
+          <w:color w:val="222222"/>
+          <w:sz w:val="28"/>
+          <w:szCs w:val="28"/>
+        </w:rPr>
+        <w:t xml:space="preserve"> University login must be fiu2-jdoe0001.</w:t>
       </w:r>
     </w:p>
     <w:p>
@@ -359,7 +412,27 @@
           <w:sz w:val="28"/>
           <w:szCs w:val="28"/>
         </w:rPr>
-        <w:t>For the password, you must enter a password that is 6 character or longer, but no longer than 14 characters. If you choose a password that is longer than 14 characters, your credentials on some of the Windows virtual machines in your vLab will not be created.</w:t>
+        <w:t xml:space="preserve">For the password, you must enter a password that is 6 character or longer, but no longer than 14 characters. If you choose a password that is longer than 14 characters, your credentials on some of the Windows virtual machines in your </w:t>
+      </w:r>
+      <w:proofErr w:type="spellStart"/>
+      <w:r>
+        <w:rPr>
+          <w:rFonts w:cs="Arial"/>
+          <w:color w:val="222222"/>
+          <w:sz w:val="28"/>
+          <w:szCs w:val="28"/>
+        </w:rPr>
+        <w:t>vLab</w:t>
+      </w:r>
+      <w:proofErr w:type="spellEnd"/>
+      <w:r>
+        <w:rPr>
+          <w:rFonts w:cs="Arial"/>
+          <w:color w:val="222222"/>
+          <w:sz w:val="28"/>
+          <w:szCs w:val="28"/>
+        </w:rPr>
+        <w:t xml:space="preserve"> will not be created.</w:t>
       </w:r>
     </w:p>
     <w:p>
@@ -677,7 +750,29 @@
           <w:sz w:val="28"/>
           <w:szCs w:val="28"/>
         </w:rPr>
-        <w:t xml:space="preserve"> is part 2 of “Creating Your Kaseya University Account”. I assume that you have already watched Part 1, followed the instructions there</w:t>
+        <w:t xml:space="preserve"> is part 2 of “Creating Your </w:t>
+      </w:r>
+      <w:proofErr w:type="spellStart"/>
+      <w:r>
+        <w:rPr>
+          <w:rFonts w:cs="Arial"/>
+          <w:bCs/>
+          <w:color w:val="222222"/>
+          <w:sz w:val="28"/>
+          <w:szCs w:val="28"/>
+        </w:rPr>
+        <w:t>Kaseya</w:t>
+      </w:r>
+      <w:proofErr w:type="spellEnd"/>
+      <w:r>
+        <w:rPr>
+          <w:rFonts w:cs="Arial"/>
+          <w:bCs/>
+          <w:color w:val="222222"/>
+          <w:sz w:val="28"/>
+          <w:szCs w:val="28"/>
+        </w:rPr>
+        <w:t xml:space="preserve"> University Account”. I assume that you have already watched Part 1, followed the instructions there</w:t>
       </w:r>
       <w:r>
         <w:rPr>
@@ -697,7 +792,47 @@
           <w:sz w:val="28"/>
           <w:szCs w:val="28"/>
         </w:rPr>
-        <w:t xml:space="preserve">and have received a confirmation email for the account that you have successfully created. If this is not the case, please stop this video, watch the first part </w:t>
+        <w:t>and have received a confirmation email for the account that you have successfully created. If this is not the case, please stop this video, watch the first part</w:t>
+      </w:r>
+      <w:r>
+        <w:rPr>
+          <w:rFonts w:cs="Arial"/>
+          <w:bCs/>
+          <w:color w:val="222222"/>
+          <w:sz w:val="28"/>
+          <w:szCs w:val="28"/>
+        </w:rPr>
+        <w:t xml:space="preserve"> </w:t>
+      </w:r>
+      <w:r>
+        <w:rPr>
+          <w:rFonts w:cs="Arial"/>
+          <w:bCs/>
+          <w:color w:val="222222"/>
+          <w:sz w:val="28"/>
+          <w:szCs w:val="28"/>
+        </w:rPr>
+        <w:t xml:space="preserve">first </w:t>
+      </w:r>
+      <w:r>
+        <w:rPr>
+          <w:rFonts w:cs="Arial"/>
+          <w:bCs/>
+          <w:color w:val="222222"/>
+          <w:sz w:val="28"/>
+          <w:szCs w:val="28"/>
+        </w:rPr>
+        <w:t>by going to this link</w:t>
+      </w:r>
+      <w:r>
+        <w:rPr>
+          <w:rFonts w:cs="Arial"/>
+          <w:bCs/>
+          <w:color w:val="222222"/>
+          <w:sz w:val="28"/>
+          <w:szCs w:val="28"/>
+        </w:rPr>
+        <w:t xml:space="preserve"> </w:t>
       </w:r>
       <w:r>
         <w:rPr>
@@ -731,17 +866,105 @@
         </w:rPr>
         <w:t xml:space="preserve">) </w:t>
       </w:r>
-      <w:bookmarkStart w:id="0" w:name="_GoBack"/>
-      <w:bookmarkEnd w:id="0"/>
-      <w:r>
-        <w:rPr>
-          <w:rFonts w:cs="Arial"/>
-          <w:bCs/>
-          <w:color w:val="222222"/>
-          <w:sz w:val="28"/>
-          <w:szCs w:val="28"/>
-        </w:rPr>
-        <w:t xml:space="preserve">and then come back to this one. </w:t>
+      <w:r>
+        <w:rPr>
+          <w:rFonts w:cs="Arial"/>
+          <w:bCs/>
+          <w:color w:val="222222"/>
+          <w:sz w:val="28"/>
+          <w:szCs w:val="28"/>
+        </w:rPr>
+        <w:t xml:space="preserve">and </w:t>
+      </w:r>
+      <w:r>
+        <w:rPr>
+          <w:rFonts w:cs="Arial"/>
+          <w:bCs/>
+          <w:color w:val="222222"/>
+          <w:sz w:val="28"/>
+          <w:szCs w:val="28"/>
+        </w:rPr>
+        <w:t xml:space="preserve">when you are </w:t>
+      </w:r>
+      <w:r>
+        <w:rPr>
+          <w:rFonts w:cs="Arial"/>
+          <w:bCs/>
+          <w:color w:val="222222"/>
+          <w:sz w:val="28"/>
+          <w:szCs w:val="28"/>
+        </w:rPr>
+        <w:t xml:space="preserve">completely </w:t>
+      </w:r>
+      <w:r>
+        <w:rPr>
+          <w:rFonts w:cs="Arial"/>
+          <w:bCs/>
+          <w:color w:val="222222"/>
+          <w:sz w:val="28"/>
+          <w:szCs w:val="28"/>
+        </w:rPr>
+        <w:t>done</w:t>
+      </w:r>
+      <w:r>
+        <w:rPr>
+          <w:rFonts w:cs="Arial"/>
+          <w:bCs/>
+          <w:color w:val="222222"/>
+          <w:sz w:val="28"/>
+          <w:szCs w:val="28"/>
+        </w:rPr>
+        <w:t xml:space="preserve"> with the first part</w:t>
+      </w:r>
+      <w:r>
+        <w:rPr>
+          <w:rFonts w:cs="Arial"/>
+          <w:bCs/>
+          <w:color w:val="222222"/>
+          <w:sz w:val="28"/>
+          <w:szCs w:val="28"/>
+        </w:rPr>
+        <w:t xml:space="preserve">, </w:t>
+      </w:r>
+      <w:r>
+        <w:rPr>
+          <w:rFonts w:cs="Arial"/>
+          <w:bCs/>
+          <w:color w:val="222222"/>
+          <w:sz w:val="28"/>
+          <w:szCs w:val="28"/>
+        </w:rPr>
+        <w:t xml:space="preserve">then you can </w:t>
+      </w:r>
+      <w:r>
+        <w:rPr>
+          <w:rFonts w:cs="Arial"/>
+          <w:bCs/>
+          <w:color w:val="222222"/>
+          <w:sz w:val="28"/>
+          <w:szCs w:val="28"/>
+        </w:rPr>
+        <w:t xml:space="preserve">come back to this </w:t>
+      </w:r>
+      <w:r>
+        <w:rPr>
+          <w:rFonts w:cs="Arial"/>
+          <w:bCs/>
+          <w:color w:val="222222"/>
+          <w:sz w:val="28"/>
+          <w:szCs w:val="28"/>
+        </w:rPr>
+        <w:t>one</w:t>
+      </w:r>
+      <w:r>
+        <w:rPr>
+          <w:rFonts w:cs="Arial"/>
+          <w:bCs/>
+          <w:color w:val="222222"/>
+          <w:sz w:val="28"/>
+          <w:szCs w:val="28"/>
+        </w:rPr>
+        <w:t xml:space="preserve">. </w:t>
       </w:r>
     </w:p>
     <w:p>
@@ -830,25 +1053,153 @@
           <w:sz w:val="28"/>
           <w:szCs w:val="28"/>
         </w:rPr>
-        <w:t xml:space="preserve"> a confirmation email that looks like this. Pl</w:t>
-      </w:r>
-      <w:r>
-        <w:rPr>
-          <w:rFonts w:cs="Arial"/>
-          <w:color w:val="222222"/>
-          <w:sz w:val="28"/>
-          <w:szCs w:val="28"/>
-        </w:rPr>
-        <w:t>ease do read this</w:t>
-      </w:r>
-      <w:r>
-        <w:rPr>
-          <w:rFonts w:cs="Arial"/>
-          <w:color w:val="222222"/>
-          <w:sz w:val="28"/>
-          <w:szCs w:val="28"/>
-        </w:rPr>
-        <w:t xml:space="preserve"> email carefully. It basically provides you with an activation link that you should click to activate your account. It also includes the link to the Kaseya University web site for your future reference and asks you to read the term and conditions that would need to be accepted before you can login to t</w:t>
+        <w:t xml:space="preserve"> a confirmation email that looks like this</w:t>
+      </w:r>
+      <w:r>
+        <w:rPr>
+          <w:rFonts w:cs="Arial"/>
+          <w:color w:val="222222"/>
+          <w:sz w:val="28"/>
+          <w:szCs w:val="28"/>
+        </w:rPr>
+        <w:t xml:space="preserve"> one received by John Doe</w:t>
+      </w:r>
+      <w:r>
+        <w:rPr>
+          <w:rFonts w:cs="Arial"/>
+          <w:color w:val="222222"/>
+          <w:sz w:val="28"/>
+          <w:szCs w:val="28"/>
+        </w:rPr>
+        <w:t>. Pl</w:t>
+      </w:r>
+      <w:r>
+        <w:rPr>
+          <w:rFonts w:cs="Arial"/>
+          <w:color w:val="222222"/>
+          <w:sz w:val="28"/>
+          <w:szCs w:val="28"/>
+        </w:rPr>
+        <w:t xml:space="preserve">ease </w:t>
+      </w:r>
+      <w:r>
+        <w:rPr>
+          <w:rFonts w:cs="Arial"/>
+          <w:color w:val="222222"/>
+          <w:sz w:val="28"/>
+          <w:szCs w:val="28"/>
+        </w:rPr>
+        <w:t xml:space="preserve">take your time and </w:t>
+      </w:r>
+      <w:r>
+        <w:rPr>
+          <w:rFonts w:cs="Arial"/>
+          <w:color w:val="222222"/>
+          <w:sz w:val="28"/>
+          <w:szCs w:val="28"/>
+        </w:rPr>
+        <w:t>do read this</w:t>
+      </w:r>
+      <w:r>
+        <w:rPr>
+          <w:rFonts w:cs="Arial"/>
+          <w:color w:val="222222"/>
+          <w:sz w:val="28"/>
+          <w:szCs w:val="28"/>
+        </w:rPr>
+        <w:t xml:space="preserve"> email carefully. It</w:t>
+      </w:r>
+      <w:r>
+        <w:rPr>
+          <w:rFonts w:cs="Arial"/>
+          <w:color w:val="222222"/>
+          <w:sz w:val="28"/>
+          <w:szCs w:val="28"/>
+        </w:rPr>
+        <w:t xml:space="preserve"> basically provides you with a </w:t>
+      </w:r>
+      <w:r>
+        <w:rPr>
+          <w:rFonts w:cs="Arial"/>
+          <w:color w:val="222222"/>
+          <w:sz w:val="28"/>
+          <w:szCs w:val="28"/>
+        </w:rPr>
+        <w:t xml:space="preserve">link to activate your account. It also includes the link to the </w:t>
+      </w:r>
+      <w:proofErr w:type="spellStart"/>
+      <w:r>
+        <w:rPr>
+          <w:rFonts w:cs="Arial"/>
+          <w:color w:val="222222"/>
+          <w:sz w:val="28"/>
+          <w:szCs w:val="28"/>
+        </w:rPr>
+        <w:t>Kaseya</w:t>
+      </w:r>
+      <w:proofErr w:type="spellEnd"/>
+      <w:r>
+        <w:rPr>
+          <w:rFonts w:cs="Arial"/>
+          <w:color w:val="222222"/>
+          <w:sz w:val="28"/>
+          <w:szCs w:val="28"/>
+        </w:rPr>
+        <w:t xml:space="preserve"> University web site for your future reference and </w:t>
+      </w:r>
+      <w:r>
+        <w:rPr>
+          <w:rFonts w:cs="Arial"/>
+          <w:color w:val="222222"/>
+          <w:sz w:val="28"/>
+          <w:szCs w:val="28"/>
+        </w:rPr>
+        <w:t xml:space="preserve">informs </w:t>
+      </w:r>
+      <w:r>
+        <w:rPr>
+          <w:rFonts w:cs="Arial"/>
+          <w:color w:val="222222"/>
+          <w:sz w:val="28"/>
+          <w:szCs w:val="28"/>
+        </w:rPr>
+        <w:t xml:space="preserve">you </w:t>
+      </w:r>
+      <w:r>
+        <w:rPr>
+          <w:rFonts w:cs="Arial"/>
+          <w:color w:val="222222"/>
+          <w:sz w:val="28"/>
+          <w:szCs w:val="28"/>
+        </w:rPr>
+        <w:t xml:space="preserve">that you will need </w:t>
+      </w:r>
+      <w:r>
+        <w:rPr>
+          <w:rFonts w:cs="Arial"/>
+          <w:color w:val="222222"/>
+          <w:sz w:val="28"/>
+          <w:szCs w:val="28"/>
+        </w:rPr>
+        <w:t xml:space="preserve">to read </w:t>
+      </w:r>
+      <w:r>
+        <w:rPr>
+          <w:rFonts w:cs="Arial"/>
+          <w:color w:val="222222"/>
+          <w:sz w:val="28"/>
+          <w:szCs w:val="28"/>
+        </w:rPr>
+        <w:t xml:space="preserve">and accept </w:t>
+      </w:r>
+      <w:r>
+        <w:rPr>
+          <w:rFonts w:cs="Arial"/>
+          <w:color w:val="222222"/>
+          <w:sz w:val="28"/>
+          <w:szCs w:val="28"/>
+        </w:rPr>
+        <w:t>the term and conditions before you can login to t</w:t>
       </w:r>
       <w:r>
         <w:rPr>
@@ -1013,7 +1364,27 @@
           <w:sz w:val="28"/>
           <w:szCs w:val="28"/>
         </w:rPr>
-        <w:t xml:space="preserve"> and let me know that you have followed the above instructions and could successfully create and activate your Kaseya University account. </w:t>
+        <w:t xml:space="preserve"> and let me know that you have followed the above instructions and could successfully create and activate your </w:t>
+      </w:r>
+      <w:proofErr w:type="spellStart"/>
+      <w:r>
+        <w:rPr>
+          <w:rFonts w:cs="Arial"/>
+          <w:color w:val="222222"/>
+          <w:sz w:val="28"/>
+          <w:szCs w:val="28"/>
+        </w:rPr>
+        <w:t>Kaseya</w:t>
+      </w:r>
+      <w:proofErr w:type="spellEnd"/>
+      <w:r>
+        <w:rPr>
+          <w:rFonts w:cs="Arial"/>
+          <w:color w:val="222222"/>
+          <w:sz w:val="28"/>
+          <w:szCs w:val="28"/>
+        </w:rPr>
+        <w:t xml:space="preserve"> University account. </w:t>
       </w:r>
     </w:p>
     <w:p>
@@ -1537,7 +1908,181 @@
           <w:sz w:val="28"/>
           <w:szCs w:val="28"/>
         </w:rPr>
-        <w:t xml:space="preserve">Once you receive my confirmation email regarding activating your vLab, you are with creating your Kaseya University account. Congratulations! </w:t>
+        <w:t xml:space="preserve">Once you receive my confirmation email regarding activating your </w:t>
+      </w:r>
+      <w:proofErr w:type="spellStart"/>
+      <w:r>
+        <w:rPr>
+          <w:rFonts w:ascii="Times" w:hAnsi="Times" w:cs="Arial"/>
+          <w:sz w:val="28"/>
+          <w:szCs w:val="28"/>
+        </w:rPr>
+        <w:t>vLab</w:t>
+      </w:r>
+      <w:proofErr w:type="spellEnd"/>
+      <w:r>
+        <w:rPr>
+          <w:rFonts w:ascii="Times" w:hAnsi="Times" w:cs="Arial"/>
+          <w:sz w:val="28"/>
+          <w:szCs w:val="28"/>
+        </w:rPr>
+        <w:t xml:space="preserve">, you are </w:t>
+      </w:r>
+      <w:r>
+        <w:rPr>
+          <w:rFonts w:ascii="Times" w:hAnsi="Times" w:cs="Arial"/>
+          <w:sz w:val="28"/>
+          <w:szCs w:val="28"/>
+        </w:rPr>
+        <w:t xml:space="preserve">done </w:t>
+      </w:r>
+      <w:r>
+        <w:rPr>
+          <w:rFonts w:ascii="Times" w:hAnsi="Times" w:cs="Arial"/>
+          <w:sz w:val="28"/>
+          <w:szCs w:val="28"/>
+        </w:rPr>
+        <w:t xml:space="preserve">with creating your </w:t>
+      </w:r>
+      <w:proofErr w:type="spellStart"/>
+      <w:r>
+        <w:rPr>
+          <w:rFonts w:ascii="Times" w:hAnsi="Times" w:cs="Arial"/>
+          <w:sz w:val="28"/>
+          <w:szCs w:val="28"/>
+        </w:rPr>
+        <w:t>Kaseya</w:t>
+      </w:r>
+      <w:proofErr w:type="spellEnd"/>
+      <w:r>
+        <w:rPr>
+          <w:rFonts w:ascii="Times" w:hAnsi="Times" w:cs="Arial"/>
+          <w:sz w:val="28"/>
+          <w:szCs w:val="28"/>
+        </w:rPr>
+        <w:t xml:space="preserve"> University account. Congratulations! </w:t>
+      </w:r>
+      <w:r>
+        <w:rPr>
+          <w:rFonts w:ascii="Times" w:hAnsi="Times" w:cs="Arial"/>
+          <w:sz w:val="28"/>
+          <w:szCs w:val="28"/>
+        </w:rPr>
+        <w:sym w:font="Wingdings" w:char="F04A"/>
+      </w:r>
+    </w:p>
+    <w:p>
+      <w:pPr>
+        <w:rPr>
+          <w:rFonts w:ascii="Times" w:hAnsi="Times" w:cs="Arial"/>
+          <w:sz w:val="28"/>
+          <w:szCs w:val="28"/>
+        </w:rPr>
+      </w:pPr>
+    </w:p>
+    <w:p>
+      <w:pPr>
+        <w:rPr>
+          <w:rFonts w:ascii="Times" w:hAnsi="Times" w:cs="Arial"/>
+          <w:sz w:val="28"/>
+          <w:szCs w:val="28"/>
+        </w:rPr>
+      </w:pPr>
+      <w:r>
+        <w:rPr>
+          <w:rFonts w:ascii="Times" w:hAnsi="Times" w:cs="Arial"/>
+          <w:sz w:val="28"/>
+          <w:szCs w:val="28"/>
+        </w:rPr>
+        <w:t xml:space="preserve">The next time you login to </w:t>
+      </w:r>
+      <w:proofErr w:type="spellStart"/>
+      <w:r>
+        <w:rPr>
+          <w:rFonts w:ascii="Times" w:hAnsi="Times" w:cs="Arial"/>
+          <w:sz w:val="28"/>
+          <w:szCs w:val="28"/>
+        </w:rPr>
+        <w:t>Kaseya</w:t>
+      </w:r>
+      <w:proofErr w:type="spellEnd"/>
+      <w:r>
+        <w:rPr>
+          <w:rFonts w:ascii="Times" w:hAnsi="Times" w:cs="Arial"/>
+          <w:sz w:val="28"/>
+          <w:szCs w:val="28"/>
+        </w:rPr>
+        <w:t xml:space="preserve"> University, not only you see all the course contents, but also, you will see the icons for Hands-on Exercises document, Virtual Lab, and Certificate Exam. </w:t>
+      </w:r>
+      <w:r>
+        <w:rPr>
+          <w:rFonts w:ascii="Times" w:hAnsi="Times" w:cs="Arial"/>
+          <w:sz w:val="28"/>
+          <w:szCs w:val="28"/>
+        </w:rPr>
+        <w:t>Note that i</w:t>
+      </w:r>
+      <w:bookmarkStart w:id="0" w:name="_GoBack"/>
+      <w:bookmarkEnd w:id="0"/>
+      <w:r>
+        <w:rPr>
+          <w:rFonts w:ascii="Times" w:hAnsi="Times" w:cs="Arial"/>
+          <w:sz w:val="28"/>
+          <w:szCs w:val="28"/>
+        </w:rPr>
+        <w:t>t may be the case that from time to time, the Certificate Exam icon is disabled for maintenance purposes.</w:t>
+      </w:r>
+    </w:p>
+    <w:p>
+      <w:pPr>
+        <w:rPr>
+          <w:rFonts w:ascii="Times" w:hAnsi="Times" w:cs="Arial"/>
+          <w:sz w:val="28"/>
+          <w:szCs w:val="28"/>
+        </w:rPr>
+      </w:pPr>
+    </w:p>
+    <w:p>
+      <w:pPr>
+        <w:rPr>
+          <w:rFonts w:ascii="Times" w:hAnsi="Times" w:cs="Arial"/>
+          <w:sz w:val="28"/>
+          <w:szCs w:val="28"/>
+        </w:rPr>
+      </w:pPr>
+      <w:r>
+        <w:rPr>
+          <w:rFonts w:ascii="Times" w:hAnsi="Times" w:cs="Arial"/>
+          <w:sz w:val="28"/>
+          <w:szCs w:val="28"/>
+        </w:rPr>
+        <w:t xml:space="preserve">I hope that this video has been helpful to you. As always, should you have any questions, please do not hesitate to contact me. </w:t>
+      </w:r>
+    </w:p>
+    <w:p>
+      <w:pPr>
+        <w:rPr>
+          <w:rFonts w:ascii="Times" w:hAnsi="Times" w:cs="Arial"/>
+          <w:sz w:val="28"/>
+          <w:szCs w:val="28"/>
+        </w:rPr>
+      </w:pPr>
+    </w:p>
+    <w:p>
+      <w:pPr>
+        <w:rPr>
+          <w:rFonts w:ascii="Times" w:hAnsi="Times" w:cs="Arial"/>
+          <w:sz w:val="28"/>
+          <w:szCs w:val="28"/>
+        </w:rPr>
+      </w:pPr>
+      <w:r>
+        <w:rPr>
+          <w:rFonts w:ascii="Times" w:hAnsi="Times" w:cs="Arial"/>
+          <w:sz w:val="28"/>
+          <w:szCs w:val="28"/>
+        </w:rPr>
+        <w:t xml:space="preserve">Have a wonderful day! </w:t>
       </w:r>
       <w:r>
         <w:rPr>

</xml_diff>